<commit_message>
them clear structure, reset web bcodeviewr
</commit_message>
<xml_diff>
--- a/Cấu trúc Bcode  BcodeViewer.docx
+++ b/Cấu trúc Bcode  BcodeViewer.docx
@@ -354,12 +354,6 @@
         <w:gridCol w:w="4445"/>
       </w:tblGrid>
       <w:tr>
-        <w:tblPrEx>
-          <w:tblCellMar>
-            <w:top w:w="0" w:type="dxa"/>
-            <w:bottom w:w="0" w:type="dxa"/>
-          </w:tblCellMar>
-        </w:tblPrEx>
         <w:trPr>
           <w:tblHeader/>
         </w:trPr>
@@ -434,12 +428,6 @@
         </w:tc>
       </w:tr>
       <w:tr>
-        <w:tblPrEx>
-          <w:tblCellMar>
-            <w:top w:w="0" w:type="dxa"/>
-            <w:bottom w:w="0" w:type="dxa"/>
-          </w:tblCellMar>
-        </w:tblPrEx>
         <w:tc>
           <w:tcPr>
             <w:tcW w:w="1778" w:type="dxa"/>
@@ -490,12 +478,6 @@
         </w:tc>
       </w:tr>
       <w:tr>
-        <w:tblPrEx>
-          <w:tblCellMar>
-            <w:top w:w="0" w:type="dxa"/>
-            <w:bottom w:w="0" w:type="dxa"/>
-          </w:tblCellMar>
-        </w:tblPrEx>
         <w:tc>
           <w:tcPr>
             <w:tcW w:w="1778" w:type="dxa"/>
@@ -549,12 +531,6 @@
         </w:tc>
       </w:tr>
       <w:tr>
-        <w:tblPrEx>
-          <w:tblCellMar>
-            <w:top w:w="0" w:type="dxa"/>
-            <w:bottom w:w="0" w:type="dxa"/>
-          </w:tblCellMar>
-        </w:tblPrEx>
         <w:tc>
           <w:tcPr>
             <w:tcW w:w="1778" w:type="dxa"/>
@@ -612,12 +588,6 @@
         </w:tc>
       </w:tr>
       <w:tr>
-        <w:tblPrEx>
-          <w:tblCellMar>
-            <w:top w:w="0" w:type="dxa"/>
-            <w:bottom w:w="0" w:type="dxa"/>
-          </w:tblCellMar>
-        </w:tblPrEx>
         <w:tc>
           <w:tcPr>
             <w:tcW w:w="1778" w:type="dxa"/>
@@ -671,12 +641,6 @@
         </w:tc>
       </w:tr>
       <w:tr>
-        <w:tblPrEx>
-          <w:tblCellMar>
-            <w:top w:w="0" w:type="dxa"/>
-            <w:bottom w:w="0" w:type="dxa"/>
-          </w:tblCellMar>
-        </w:tblPrEx>
         <w:tc>
           <w:tcPr>
             <w:tcW w:w="1778" w:type="dxa"/>
@@ -728,12 +692,6 @@
         </w:tc>
       </w:tr>
       <w:tr>
-        <w:tblPrEx>
-          <w:tblCellMar>
-            <w:top w:w="0" w:type="dxa"/>
-            <w:bottom w:w="0" w:type="dxa"/>
-          </w:tblCellMar>
-        </w:tblPrEx>
         <w:tc>
           <w:tcPr>
             <w:tcW w:w="1778" w:type="dxa"/>
@@ -787,12 +745,6 @@
         </w:tc>
       </w:tr>
       <w:tr>
-        <w:tblPrEx>
-          <w:tblCellMar>
-            <w:top w:w="0" w:type="dxa"/>
-            <w:bottom w:w="0" w:type="dxa"/>
-          </w:tblCellMar>
-        </w:tblPrEx>
         <w:tc>
           <w:tcPr>
             <w:tcW w:w="1778" w:type="dxa"/>
@@ -881,12 +833,6 @@
         <w:gridCol w:w="4048"/>
       </w:tblGrid>
       <w:tr>
-        <w:tblPrEx>
-          <w:tblCellMar>
-            <w:top w:w="0" w:type="dxa"/>
-            <w:bottom w:w="0" w:type="dxa"/>
-          </w:tblCellMar>
-        </w:tblPrEx>
         <w:trPr>
           <w:tblHeader/>
         </w:trPr>
@@ -961,12 +907,6 @@
         </w:tc>
       </w:tr>
       <w:tr>
-        <w:tblPrEx>
-          <w:tblCellMar>
-            <w:top w:w="0" w:type="dxa"/>
-            <w:bottom w:w="0" w:type="dxa"/>
-          </w:tblCellMar>
-        </w:tblPrEx>
         <w:tc>
           <w:tcPr>
             <w:tcW w:w="2059" w:type="dxa"/>
@@ -1017,12 +957,6 @@
         </w:tc>
       </w:tr>
       <w:tr>
-        <w:tblPrEx>
-          <w:tblCellMar>
-            <w:top w:w="0" w:type="dxa"/>
-            <w:bottom w:w="0" w:type="dxa"/>
-          </w:tblCellMar>
-        </w:tblPrEx>
         <w:tc>
           <w:tcPr>
             <w:tcW w:w="2059" w:type="dxa"/>
@@ -1076,12 +1010,6 @@
         </w:tc>
       </w:tr>
       <w:tr>
-        <w:tblPrEx>
-          <w:tblCellMar>
-            <w:top w:w="0" w:type="dxa"/>
-            <w:bottom w:w="0" w:type="dxa"/>
-          </w:tblCellMar>
-        </w:tblPrEx>
         <w:tc>
           <w:tcPr>
             <w:tcW w:w="2059" w:type="dxa"/>
@@ -1177,12 +1105,6 @@
         <w:gridCol w:w="4335"/>
       </w:tblGrid>
       <w:tr>
-        <w:tblPrEx>
-          <w:tblCellMar>
-            <w:top w:w="0" w:type="dxa"/>
-            <w:bottom w:w="0" w:type="dxa"/>
-          </w:tblCellMar>
-        </w:tblPrEx>
         <w:trPr>
           <w:tblHeader/>
         </w:trPr>
@@ -1257,12 +1179,6 @@
         </w:tc>
       </w:tr>
       <w:tr>
-        <w:tblPrEx>
-          <w:tblCellMar>
-            <w:top w:w="0" w:type="dxa"/>
-            <w:bottom w:w="0" w:type="dxa"/>
-          </w:tblCellMar>
-        </w:tblPrEx>
         <w:tc>
           <w:tcPr>
             <w:tcW w:w="1872" w:type="dxa"/>
@@ -1330,12 +1246,6 @@
         </w:tc>
       </w:tr>
       <w:tr>
-        <w:tblPrEx>
-          <w:tblCellMar>
-            <w:top w:w="0" w:type="dxa"/>
-            <w:bottom w:w="0" w:type="dxa"/>
-          </w:tblCellMar>
-        </w:tblPrEx>
         <w:tc>
           <w:tcPr>
             <w:tcW w:w="1872" w:type="dxa"/>
@@ -1390,12 +1300,6 @@
         </w:tc>
       </w:tr>
       <w:tr>
-        <w:tblPrEx>
-          <w:tblCellMar>
-            <w:top w:w="0" w:type="dxa"/>
-            <w:bottom w:w="0" w:type="dxa"/>
-          </w:tblCellMar>
-        </w:tblPrEx>
         <w:tc>
           <w:tcPr>
             <w:tcW w:w="1872" w:type="dxa"/>
@@ -1454,12 +1358,6 @@
         </w:tc>
       </w:tr>
       <w:tr>
-        <w:tblPrEx>
-          <w:tblCellMar>
-            <w:top w:w="0" w:type="dxa"/>
-            <w:bottom w:w="0" w:type="dxa"/>
-          </w:tblCellMar>
-        </w:tblPrEx>
         <w:tc>
           <w:tcPr>
             <w:tcW w:w="1872" w:type="dxa"/>
@@ -1521,12 +1419,6 @@
         </w:tc>
       </w:tr>
       <w:tr>
-        <w:tblPrEx>
-          <w:tblCellMar>
-            <w:top w:w="0" w:type="dxa"/>
-            <w:bottom w:w="0" w:type="dxa"/>
-          </w:tblCellMar>
-        </w:tblPrEx>
         <w:tc>
           <w:tcPr>
             <w:tcW w:w="1872" w:type="dxa"/>
@@ -1613,12 +1505,6 @@
         </w:tc>
       </w:tr>
       <w:tr>
-        <w:tblPrEx>
-          <w:tblCellMar>
-            <w:top w:w="0" w:type="dxa"/>
-            <w:bottom w:w="0" w:type="dxa"/>
-          </w:tblCellMar>
-        </w:tblPrEx>
         <w:tc>
           <w:tcPr>
             <w:tcW w:w="1872" w:type="dxa"/>
@@ -1673,12 +1559,6 @@
         </w:tc>
       </w:tr>
       <w:tr>
-        <w:tblPrEx>
-          <w:tblCellMar>
-            <w:top w:w="0" w:type="dxa"/>
-            <w:bottom w:w="0" w:type="dxa"/>
-          </w:tblCellMar>
-        </w:tblPrEx>
         <w:tc>
           <w:tcPr>
             <w:tcW w:w="1872" w:type="dxa"/>
@@ -1753,12 +1633,6 @@
         </w:tc>
       </w:tr>
       <w:tr>
-        <w:tblPrEx>
-          <w:tblCellMar>
-            <w:top w:w="0" w:type="dxa"/>
-            <w:bottom w:w="0" w:type="dxa"/>
-          </w:tblCellMar>
-        </w:tblPrEx>
         <w:tc>
           <w:tcPr>
             <w:tcW w:w="1872" w:type="dxa"/>
@@ -1812,12 +1686,6 @@
         </w:tc>
       </w:tr>
       <w:tr>
-        <w:tblPrEx>
-          <w:tblCellMar>
-            <w:top w:w="0" w:type="dxa"/>
-            <w:bottom w:w="0" w:type="dxa"/>
-          </w:tblCellMar>
-        </w:tblPrEx>
         <w:tc>
           <w:tcPr>
             <w:tcW w:w="1872" w:type="dxa"/>
@@ -1868,12 +1736,6 @@
         </w:tc>
       </w:tr>
       <w:tr>
-        <w:tblPrEx>
-          <w:tblCellMar>
-            <w:top w:w="0" w:type="dxa"/>
-            <w:bottom w:w="0" w:type="dxa"/>
-          </w:tblCellMar>
-        </w:tblPrEx>
         <w:tc>
           <w:tcPr>
             <w:tcW w:w="1872" w:type="dxa"/>
@@ -1927,12 +1789,6 @@
         </w:tc>
       </w:tr>
       <w:tr>
-        <w:tblPrEx>
-          <w:tblCellMar>
-            <w:top w:w="0" w:type="dxa"/>
-            <w:bottom w:w="0" w:type="dxa"/>
-          </w:tblCellMar>
-        </w:tblPrEx>
         <w:tc>
           <w:tcPr>
             <w:tcW w:w="1872" w:type="dxa"/>
@@ -1983,12 +1839,6 @@
         </w:tc>
       </w:tr>
       <w:tr>
-        <w:tblPrEx>
-          <w:tblCellMar>
-            <w:top w:w="0" w:type="dxa"/>
-            <w:bottom w:w="0" w:type="dxa"/>
-          </w:tblCellMar>
-        </w:tblPrEx>
         <w:tc>
           <w:tcPr>
             <w:tcW w:w="1872" w:type="dxa"/>
@@ -2043,12 +1893,6 @@
         </w:tc>
       </w:tr>
       <w:tr>
-        <w:tblPrEx>
-          <w:tblCellMar>
-            <w:top w:w="0" w:type="dxa"/>
-            <w:bottom w:w="0" w:type="dxa"/>
-          </w:tblCellMar>
-        </w:tblPrEx>
         <w:tc>
           <w:tcPr>
             <w:tcW w:w="1872" w:type="dxa"/>
@@ -2099,12 +1943,6 @@
         </w:tc>
       </w:tr>
       <w:tr>
-        <w:tblPrEx>
-          <w:tblCellMar>
-            <w:top w:w="0" w:type="dxa"/>
-            <w:bottom w:w="0" w:type="dxa"/>
-          </w:tblCellMar>
-        </w:tblPrEx>
         <w:tc>
           <w:tcPr>
             <w:tcW w:w="1872" w:type="dxa"/>
@@ -2158,12 +1996,6 @@
         </w:tc>
       </w:tr>
       <w:tr>
-        <w:tblPrEx>
-          <w:tblCellMar>
-            <w:top w:w="0" w:type="dxa"/>
-            <w:bottom w:w="0" w:type="dxa"/>
-          </w:tblCellMar>
-        </w:tblPrEx>
         <w:tc>
           <w:tcPr>
             <w:tcW w:w="1872" w:type="dxa"/>
@@ -2247,12 +2079,6 @@
         </w:tc>
       </w:tr>
       <w:tr>
-        <w:tblPrEx>
-          <w:tblCellMar>
-            <w:top w:w="0" w:type="dxa"/>
-            <w:bottom w:w="0" w:type="dxa"/>
-          </w:tblCellMar>
-        </w:tblPrEx>
         <w:tc>
           <w:tcPr>
             <w:tcW w:w="1872" w:type="dxa"/>
@@ -2306,12 +2132,6 @@
         </w:tc>
       </w:tr>
       <w:tr>
-        <w:tblPrEx>
-          <w:tblCellMar>
-            <w:top w:w="0" w:type="dxa"/>
-            <w:bottom w:w="0" w:type="dxa"/>
-          </w:tblCellMar>
-        </w:tblPrEx>
         <w:tc>
           <w:tcPr>
             <w:tcW w:w="1872" w:type="dxa"/>
@@ -2362,12 +2182,6 @@
         </w:tc>
       </w:tr>
       <w:tr>
-        <w:tblPrEx>
-          <w:tblCellMar>
-            <w:top w:w="0" w:type="dxa"/>
-            <w:bottom w:w="0" w:type="dxa"/>
-          </w:tblCellMar>
-        </w:tblPrEx>
         <w:tc>
           <w:tcPr>
             <w:tcW w:w="1872" w:type="dxa"/>
@@ -2448,12 +2262,6 @@
         </w:tc>
       </w:tr>
       <w:tr>
-        <w:tblPrEx>
-          <w:tblCellMar>
-            <w:top w:w="0" w:type="dxa"/>
-            <w:bottom w:w="0" w:type="dxa"/>
-          </w:tblCellMar>
-        </w:tblPrEx>
         <w:tc>
           <w:tcPr>
             <w:tcW w:w="1872" w:type="dxa"/>
@@ -2512,12 +2320,6 @@
         </w:tc>
       </w:tr>
       <w:tr>
-        <w:tblPrEx>
-          <w:tblCellMar>
-            <w:top w:w="0" w:type="dxa"/>
-            <w:bottom w:w="0" w:type="dxa"/>
-          </w:tblCellMar>
-        </w:tblPrEx>
         <w:tc>
           <w:tcPr>
             <w:tcW w:w="1872" w:type="dxa"/>
@@ -2578,12 +2380,6 @@
         </w:tc>
       </w:tr>
       <w:tr>
-        <w:tblPrEx>
-          <w:tblCellMar>
-            <w:top w:w="0" w:type="dxa"/>
-            <w:bottom w:w="0" w:type="dxa"/>
-          </w:tblCellMar>
-        </w:tblPrEx>
         <w:tc>
           <w:tcPr>
             <w:tcW w:w="1872" w:type="dxa"/>
@@ -2641,12 +2437,6 @@
         </w:tc>
       </w:tr>
       <w:tr>
-        <w:tblPrEx>
-          <w:tblCellMar>
-            <w:top w:w="0" w:type="dxa"/>
-            <w:bottom w:w="0" w:type="dxa"/>
-          </w:tblCellMar>
-        </w:tblPrEx>
         <w:tc>
           <w:tcPr>
             <w:tcW w:w="1872" w:type="dxa"/>
@@ -2715,12 +2505,6 @@
         </w:tc>
       </w:tr>
       <w:tr>
-        <w:tblPrEx>
-          <w:tblCellMar>
-            <w:top w:w="0" w:type="dxa"/>
-            <w:bottom w:w="0" w:type="dxa"/>
-          </w:tblCellMar>
-        </w:tblPrEx>
         <w:tc>
           <w:tcPr>
             <w:tcW w:w="1872" w:type="dxa"/>
@@ -2821,12 +2605,6 @@
         <w:gridCol w:w="3518"/>
       </w:tblGrid>
       <w:tr>
-        <w:tblPrEx>
-          <w:tblCellMar>
-            <w:top w:w="0" w:type="dxa"/>
-            <w:bottom w:w="0" w:type="dxa"/>
-          </w:tblCellMar>
-        </w:tblPrEx>
         <w:trPr>
           <w:tblHeader/>
         </w:trPr>
@@ -2901,12 +2679,6 @@
         </w:tc>
       </w:tr>
       <w:tr>
-        <w:tblPrEx>
-          <w:tblCellMar>
-            <w:top w:w="0" w:type="dxa"/>
-            <w:bottom w:w="0" w:type="dxa"/>
-          </w:tblCellMar>
-        </w:tblPrEx>
         <w:tc>
           <w:tcPr>
             <w:tcW w:w="1310" w:type="dxa"/>
@@ -2957,12 +2729,6 @@
         </w:tc>
       </w:tr>
       <w:tr>
-        <w:tblPrEx>
-          <w:tblCellMar>
-            <w:top w:w="0" w:type="dxa"/>
-            <w:bottom w:w="0" w:type="dxa"/>
-          </w:tblCellMar>
-        </w:tblPrEx>
         <w:tc>
           <w:tcPr>
             <w:tcW w:w="1310" w:type="dxa"/>
@@ -3087,12 +2853,6 @@
         <w:gridCol w:w="6220"/>
       </w:tblGrid>
       <w:tr>
-        <w:tblPrEx>
-          <w:tblCellMar>
-            <w:top w:w="0" w:type="dxa"/>
-            <w:bottom w:w="0" w:type="dxa"/>
-          </w:tblCellMar>
-        </w:tblPrEx>
         <w:trPr>
           <w:tblHeader/>
         </w:trPr>
@@ -3144,12 +2904,6 @@
         </w:tc>
       </w:tr>
       <w:tr>
-        <w:tblPrEx>
-          <w:tblCellMar>
-            <w:top w:w="0" w:type="dxa"/>
-            <w:bottom w:w="0" w:type="dxa"/>
-          </w:tblCellMar>
-        </w:tblPrEx>
         <w:tc>
           <w:tcPr>
             <w:tcW w:w="5148" w:type="dxa"/>
@@ -3184,12 +2938,6 @@
         </w:tc>
       </w:tr>
       <w:tr>
-        <w:tblPrEx>
-          <w:tblCellMar>
-            <w:top w:w="0" w:type="dxa"/>
-            <w:bottom w:w="0" w:type="dxa"/>
-          </w:tblCellMar>
-        </w:tblPrEx>
         <w:tc>
           <w:tcPr>
             <w:tcW w:w="5148" w:type="dxa"/>
@@ -3226,12 +2974,6 @@
         </w:tc>
       </w:tr>
       <w:tr>
-        <w:tblPrEx>
-          <w:tblCellMar>
-            <w:top w:w="0" w:type="dxa"/>
-            <w:bottom w:w="0" w:type="dxa"/>
-          </w:tblCellMar>
-        </w:tblPrEx>
         <w:tc>
           <w:tcPr>
             <w:tcW w:w="5148" w:type="dxa"/>
@@ -3266,12 +3008,6 @@
         </w:tc>
       </w:tr>
       <w:tr>
-        <w:tblPrEx>
-          <w:tblCellMar>
-            <w:top w:w="0" w:type="dxa"/>
-            <w:bottom w:w="0" w:type="dxa"/>
-          </w:tblCellMar>
-        </w:tblPrEx>
         <w:tc>
           <w:tcPr>
             <w:tcW w:w="5148" w:type="dxa"/>
@@ -3308,12 +3044,6 @@
         </w:tc>
       </w:tr>
       <w:tr>
-        <w:tblPrEx>
-          <w:tblCellMar>
-            <w:top w:w="0" w:type="dxa"/>
-            <w:bottom w:w="0" w:type="dxa"/>
-          </w:tblCellMar>
-        </w:tblPrEx>
         <w:tc>
           <w:tcPr>
             <w:tcW w:w="5148" w:type="dxa"/>
@@ -3348,12 +3078,6 @@
         </w:tc>
       </w:tr>
       <w:tr>
-        <w:tblPrEx>
-          <w:tblCellMar>
-            <w:top w:w="0" w:type="dxa"/>
-            <w:bottom w:w="0" w:type="dxa"/>
-          </w:tblCellMar>
-        </w:tblPrEx>
         <w:tc>
           <w:tcPr>
             <w:tcW w:w="5148" w:type="dxa"/>
@@ -3390,12 +3114,6 @@
         </w:tc>
       </w:tr>
       <w:tr>
-        <w:tblPrEx>
-          <w:tblCellMar>
-            <w:top w:w="0" w:type="dxa"/>
-            <w:bottom w:w="0" w:type="dxa"/>
-          </w:tblCellMar>
-        </w:tblPrEx>
         <w:tc>
           <w:tcPr>
             <w:tcW w:w="5148" w:type="dxa"/>
@@ -3431,12 +3149,6 @@
         </w:tc>
       </w:tr>
       <w:tr>
-        <w:tblPrEx>
-          <w:tblCellMar>
-            <w:top w:w="0" w:type="dxa"/>
-            <w:bottom w:w="0" w:type="dxa"/>
-          </w:tblCellMar>
-        </w:tblPrEx>
         <w:tc>
           <w:tcPr>
             <w:tcW w:w="5148" w:type="dxa"/>
@@ -3473,12 +3185,6 @@
         </w:tc>
       </w:tr>
       <w:tr>
-        <w:tblPrEx>
-          <w:tblCellMar>
-            <w:top w:w="0" w:type="dxa"/>
-            <w:bottom w:w="0" w:type="dxa"/>
-          </w:tblCellMar>
-        </w:tblPrEx>
         <w:tc>
           <w:tcPr>
             <w:tcW w:w="5148" w:type="dxa"/>
@@ -3513,12 +3219,6 @@
         </w:tc>
       </w:tr>
       <w:tr>
-        <w:tblPrEx>
-          <w:tblCellMar>
-            <w:top w:w="0" w:type="dxa"/>
-            <w:bottom w:w="0" w:type="dxa"/>
-          </w:tblCellMar>
-        </w:tblPrEx>
         <w:tc>
           <w:tcPr>
             <w:tcW w:w="5148" w:type="dxa"/>
@@ -3555,12 +3255,6 @@
         </w:tc>
       </w:tr>
       <w:tr>
-        <w:tblPrEx>
-          <w:tblCellMar>
-            <w:top w:w="0" w:type="dxa"/>
-            <w:bottom w:w="0" w:type="dxa"/>
-          </w:tblCellMar>
-        </w:tblPrEx>
         <w:tc>
           <w:tcPr>
             <w:tcW w:w="5148" w:type="dxa"/>
@@ -3595,12 +3289,6 @@
         </w:tc>
       </w:tr>
       <w:tr>
-        <w:tblPrEx>
-          <w:tblCellMar>
-            <w:top w:w="0" w:type="dxa"/>
-            <w:bottom w:w="0" w:type="dxa"/>
-          </w:tblCellMar>
-        </w:tblPrEx>
         <w:tc>
           <w:tcPr>
             <w:tcW w:w="5148" w:type="dxa"/>
@@ -3637,12 +3325,6 @@
         </w:tc>
       </w:tr>
       <w:tr>
-        <w:tblPrEx>
-          <w:tblCellMar>
-            <w:top w:w="0" w:type="dxa"/>
-            <w:bottom w:w="0" w:type="dxa"/>
-          </w:tblCellMar>
-        </w:tblPrEx>
         <w:tc>
           <w:tcPr>
             <w:tcW w:w="5148" w:type="dxa"/>
@@ -3677,12 +3359,6 @@
         </w:tc>
       </w:tr>
       <w:tr>
-        <w:tblPrEx>
-          <w:tblCellMar>
-            <w:top w:w="0" w:type="dxa"/>
-            <w:bottom w:w="0" w:type="dxa"/>
-          </w:tblCellMar>
-        </w:tblPrEx>
         <w:tc>
           <w:tcPr>
             <w:tcW w:w="5148" w:type="dxa"/>
@@ -3803,7 +3479,7 @@
     </w:p>
     <w:tbl>
       <w:tblPr>
-        <w:tblW w:w="9360" w:type="dxa"/>
+        <w:tblW w:w="5000" w:type="pct"/>
         <w:tblBorders>
           <w:top w:val="single" w:sz="4" w:space="0" w:color="BFBFBF"/>
           <w:left w:val="single" w:sz="4" w:space="0" w:color="BFBFBF"/>
@@ -3819,24 +3495,18 @@
         <w:tblLook w:val="04A0" w:firstRow="1" w:lastRow="0" w:firstColumn="1" w:lastColumn="0" w:noHBand="0" w:noVBand="1"/>
       </w:tblPr>
       <w:tblGrid>
-        <w:gridCol w:w="1042"/>
-        <w:gridCol w:w="2870"/>
-        <w:gridCol w:w="6131"/>
-        <w:gridCol w:w="3104"/>
+        <w:gridCol w:w="783"/>
+        <w:gridCol w:w="2049"/>
+        <w:gridCol w:w="4307"/>
+        <w:gridCol w:w="2211"/>
       </w:tblGrid>
       <w:tr>
-        <w:tblPrEx>
-          <w:tblCellMar>
-            <w:top w:w="0" w:type="dxa"/>
-            <w:bottom w:w="0" w:type="dxa"/>
-          </w:tblCellMar>
-        </w:tblPrEx>
         <w:trPr>
           <w:tblHeader/>
         </w:trPr>
         <w:tc>
           <w:tcPr>
-            <w:tcW w:w="1217" w:type="dxa"/>
+            <w:tcW w:w="396" w:type="pct"/>
             <w:shd w:val="clear" w:color="auto" w:fill="2E5B8A"/>
             <w:tcMar>
               <w:top w:w="80" w:type="dxa"/>
@@ -3859,7 +3529,7 @@
         </w:tc>
         <w:tc>
           <w:tcPr>
-            <w:tcW w:w="2246" w:type="dxa"/>
+            <w:tcW w:w="1092" w:type="pct"/>
             <w:shd w:val="clear" w:color="auto" w:fill="2E5B8A"/>
             <w:tcMar>
               <w:top w:w="80" w:type="dxa"/>
@@ -3882,7 +3552,7 @@
         </w:tc>
         <w:tc>
           <w:tcPr>
-            <w:tcW w:w="2246" w:type="dxa"/>
+            <w:tcW w:w="2332" w:type="pct"/>
             <w:shd w:val="clear" w:color="auto" w:fill="2E5B8A"/>
             <w:tcMar>
               <w:top w:w="80" w:type="dxa"/>
@@ -3905,7 +3575,7 @@
         </w:tc>
         <w:tc>
           <w:tcPr>
-            <w:tcW w:w="3651" w:type="dxa"/>
+            <w:tcW w:w="1180" w:type="pct"/>
             <w:shd w:val="clear" w:color="auto" w:fill="2E5B8A"/>
             <w:tcMar>
               <w:top w:w="80" w:type="dxa"/>
@@ -3928,15 +3598,9 @@
         </w:tc>
       </w:tr>
       <w:tr>
-        <w:tblPrEx>
-          <w:tblCellMar>
-            <w:top w:w="0" w:type="dxa"/>
-            <w:bottom w:w="0" w:type="dxa"/>
-          </w:tblCellMar>
-        </w:tblPrEx>
-        <w:tc>
-          <w:tcPr>
-            <w:tcW w:w="1217" w:type="dxa"/>
+        <w:tc>
+          <w:tcPr>
+            <w:tcW w:w="396" w:type="pct"/>
             <w:tcMar>
               <w:top w:w="80" w:type="dxa"/>
               <w:left w:w="100" w:type="dxa"/>
@@ -3952,7 +3616,7 @@
         </w:tc>
         <w:tc>
           <w:tcPr>
-            <w:tcW w:w="2246" w:type="dxa"/>
+            <w:tcW w:w="1092" w:type="pct"/>
             <w:tcMar>
               <w:top w:w="80" w:type="dxa"/>
               <w:left w:w="100" w:type="dxa"/>
@@ -3968,7 +3632,7 @@
         </w:tc>
         <w:tc>
           <w:tcPr>
-            <w:tcW w:w="2246" w:type="dxa"/>
+            <w:tcW w:w="2332" w:type="pct"/>
             <w:tcMar>
               <w:top w:w="80" w:type="dxa"/>
               <w:left w:w="100" w:type="dxa"/>
@@ -3984,31 +3648,29 @@
         </w:tc>
         <w:tc>
           <w:tcPr>
-            <w:tcW w:w="3651" w:type="dxa"/>
-            <w:tcMar>
-              <w:top w:w="80" w:type="dxa"/>
-              <w:left w:w="100" w:type="dxa"/>
-              <w:bottom w:w="80" w:type="dxa"/>
-              <w:right w:w="100" w:type="dxa"/>
-            </w:tcMar>
-          </w:tcPr>
-          <w:p>
-            <w:r>
-              <w:t>Khớp theo prefix vừa gõ với danh sách snippet đã lưu (cá nhân + thư mục dùng chung), lọc thêm theo pathScope nếu snippet có khai vùng file áp dụng. Đồng bộ, không debounce, không gọi mạng.</w:t>
+            <w:tcW w:w="1180" w:type="pct"/>
+            <w:tcMar>
+              <w:top w:w="80" w:type="dxa"/>
+              <w:left w:w="100" w:type="dxa"/>
+              <w:bottom w:w="80" w:type="dxa"/>
+              <w:right w:w="100" w:type="dxa"/>
+            </w:tcMar>
+          </w:tcPr>
+          <w:p>
+            <w:r>
+              <w:t xml:space="preserve">Khớp theo prefix vừa gõ với danh sách snippet đã lưu (cá nhân + thư mục dùng chung), lọc thêm theo pathScope nếu snippet có khai vùng file áp dụng. Đồng bộ, không </w:t>
+            </w:r>
+            <w:r>
+              <w:lastRenderedPageBreak/>
+              <w:t>debounce, không gọi mạng.</w:t>
             </w:r>
           </w:p>
         </w:tc>
       </w:tr>
       <w:tr>
-        <w:tblPrEx>
-          <w:tblCellMar>
-            <w:top w:w="0" w:type="dxa"/>
-            <w:bottom w:w="0" w:type="dxa"/>
-          </w:tblCellMar>
-        </w:tblPrEx>
-        <w:tc>
-          <w:tcPr>
-            <w:tcW w:w="1217" w:type="dxa"/>
+        <w:tc>
+          <w:tcPr>
+            <w:tcW w:w="396" w:type="pct"/>
             <w:shd w:val="clear" w:color="auto" w:fill="F2F2F2"/>
             <w:tcMar>
               <w:top w:w="80" w:type="dxa"/>
@@ -4026,7 +3688,7 @@
         </w:tc>
         <w:tc>
           <w:tcPr>
-            <w:tcW w:w="2246" w:type="dxa"/>
+            <w:tcW w:w="1092" w:type="pct"/>
             <w:shd w:val="clear" w:color="auto" w:fill="F2F2F2"/>
             <w:tcMar>
               <w:top w:w="80" w:type="dxa"/>
@@ -4043,7 +3705,7 @@
         </w:tc>
         <w:tc>
           <w:tcPr>
-            <w:tcW w:w="2246" w:type="dxa"/>
+            <w:tcW w:w="2332" w:type="pct"/>
             <w:shd w:val="clear" w:color="auto" w:fill="F2F2F2"/>
             <w:tcMar>
               <w:top w:w="80" w:type="dxa"/>
@@ -4060,7 +3722,7 @@
         </w:tc>
         <w:tc>
           <w:tcPr>
-            <w:tcW w:w="3651" w:type="dxa"/>
+            <w:tcW w:w="1180" w:type="pct"/>
             <w:shd w:val="clear" w:color="auto" w:fill="F2F2F2"/>
             <w:tcMar>
               <w:top w:w="80" w:type="dxa"/>
@@ -4077,15 +3739,9 @@
         </w:tc>
       </w:tr>
       <w:tr>
-        <w:tblPrEx>
-          <w:tblCellMar>
-            <w:top w:w="0" w:type="dxa"/>
-            <w:bottom w:w="0" w:type="dxa"/>
-          </w:tblCellMar>
-        </w:tblPrEx>
-        <w:tc>
-          <w:tcPr>
-            <w:tcW w:w="1217" w:type="dxa"/>
+        <w:tc>
+          <w:tcPr>
+            <w:tcW w:w="396" w:type="pct"/>
             <w:tcMar>
               <w:top w:w="80" w:type="dxa"/>
               <w:left w:w="100" w:type="dxa"/>
@@ -4101,7 +3757,7 @@
         </w:tc>
         <w:tc>
           <w:tcPr>
-            <w:tcW w:w="2246" w:type="dxa"/>
+            <w:tcW w:w="1092" w:type="pct"/>
             <w:tcMar>
               <w:top w:w="80" w:type="dxa"/>
               <w:left w:w="100" w:type="dxa"/>
@@ -4117,7 +3773,7 @@
         </w:tc>
         <w:tc>
           <w:tcPr>
-            <w:tcW w:w="2246" w:type="dxa"/>
+            <w:tcW w:w="2332" w:type="pct"/>
             <w:tcMar>
               <w:top w:w="80" w:type="dxa"/>
               <w:left w:w="100" w:type="dxa"/>
@@ -4133,7 +3789,7 @@
         </w:tc>
         <w:tc>
           <w:tcPr>
-            <w:tcW w:w="3651" w:type="dxa"/>
+            <w:tcW w:w="1180" w:type="pct"/>
             <w:tcMar>
               <w:top w:w="80" w:type="dxa"/>
               <w:left w:w="100" w:type="dxa"/>
@@ -4149,15 +3805,9 @@
         </w:tc>
       </w:tr>
       <w:tr>
-        <w:tblPrEx>
-          <w:tblCellMar>
-            <w:top w:w="0" w:type="dxa"/>
-            <w:bottom w:w="0" w:type="dxa"/>
-          </w:tblCellMar>
-        </w:tblPrEx>
-        <w:tc>
-          <w:tcPr>
-            <w:tcW w:w="1217" w:type="dxa"/>
+        <w:tc>
+          <w:tcPr>
+            <w:tcW w:w="396" w:type="pct"/>
             <w:shd w:val="clear" w:color="auto" w:fill="F2F2F2"/>
             <w:tcMar>
               <w:top w:w="80" w:type="dxa"/>
@@ -4174,7 +3824,7 @@
         </w:tc>
         <w:tc>
           <w:tcPr>
-            <w:tcW w:w="2246" w:type="dxa"/>
+            <w:tcW w:w="1092" w:type="pct"/>
             <w:shd w:val="clear" w:color="auto" w:fill="F2F2F2"/>
             <w:tcMar>
               <w:top w:w="80" w:type="dxa"/>
@@ -4191,7 +3841,7 @@
         </w:tc>
         <w:tc>
           <w:tcPr>
-            <w:tcW w:w="2246" w:type="dxa"/>
+            <w:tcW w:w="2332" w:type="pct"/>
             <w:shd w:val="clear" w:color="auto" w:fill="F2F2F2"/>
             <w:tcMar>
               <w:top w:w="80" w:type="dxa"/>
@@ -4208,7 +3858,7 @@
         </w:tc>
         <w:tc>
           <w:tcPr>
-            <w:tcW w:w="3651" w:type="dxa"/>
+            <w:tcW w:w="1180" w:type="pct"/>
             <w:shd w:val="clear" w:color="auto" w:fill="F2F2F2"/>
             <w:tcMar>
               <w:top w:w="80" w:type="dxa"/>
@@ -4225,15 +3875,9 @@
         </w:tc>
       </w:tr>
       <w:tr>
-        <w:tblPrEx>
-          <w:tblCellMar>
-            <w:top w:w="0" w:type="dxa"/>
-            <w:bottom w:w="0" w:type="dxa"/>
-          </w:tblCellMar>
-        </w:tblPrEx>
-        <w:tc>
-          <w:tcPr>
-            <w:tcW w:w="1217" w:type="dxa"/>
+        <w:tc>
+          <w:tcPr>
+            <w:tcW w:w="396" w:type="pct"/>
             <w:tcMar>
               <w:top w:w="80" w:type="dxa"/>
               <w:left w:w="100" w:type="dxa"/>
@@ -4249,7 +3893,7 @@
         </w:tc>
         <w:tc>
           <w:tcPr>
-            <w:tcW w:w="2246" w:type="dxa"/>
+            <w:tcW w:w="1092" w:type="pct"/>
             <w:tcMar>
               <w:top w:w="80" w:type="dxa"/>
               <w:left w:w="100" w:type="dxa"/>
@@ -4265,7 +3909,7 @@
         </w:tc>
         <w:tc>
           <w:tcPr>
-            <w:tcW w:w="2246" w:type="dxa"/>
+            <w:tcW w:w="2332" w:type="pct"/>
             <w:tcMar>
               <w:top w:w="80" w:type="dxa"/>
               <w:left w:w="100" w:type="dxa"/>
@@ -4281,17 +3925,21 @@
         </w:tc>
         <w:tc>
           <w:tcPr>
-            <w:tcW w:w="3651" w:type="dxa"/>
-            <w:tcMar>
-              <w:top w:w="80" w:type="dxa"/>
-              <w:left w:w="100" w:type="dxa"/>
-              <w:bottom w:w="80" w:type="dxa"/>
-              <w:right w:w="100" w:type="dxa"/>
-            </w:tcMar>
-          </w:tcPr>
-          <w:p>
-            <w:r>
-              <w:t>Vẫn gọi cả khi chỉ bấm phím cách — đề xuất bỏ guard này đã đưa cho Bee nhưng chưa áp dụng vào code. System prompt (theo vùng xml/sql/js/css + phần chung) nay đọc từ 5 file .txt trong thư mục Config/ cạnh exe (CompletionPromptConfig — tự sinh mặc định lần đầu chạy) thay vì hard-code, sửa file là có hiệu lực ngay không cần khởi động lại app. Cache theo 400 ký tự cuối trước con trỏ làm khóa; ghi cache TRƯỚC khi xét huỷ, và nếu Monaco huỷ request thì tự gọi lại editor.action.inlineSuggest.trigger để lần hỏi kế tiếp trúng cache ngay.</w:t>
+            <w:tcW w:w="1180" w:type="pct"/>
+            <w:tcMar>
+              <w:top w:w="80" w:type="dxa"/>
+              <w:left w:w="100" w:type="dxa"/>
+              <w:bottom w:w="80" w:type="dxa"/>
+              <w:right w:w="100" w:type="dxa"/>
+            </w:tcMar>
+          </w:tcPr>
+          <w:p>
+            <w:r>
+              <w:t xml:space="preserve">Vẫn gọi cả khi chỉ bấm phím cách — đề xuất bỏ guard này đã đưa cho Bee nhưng chưa áp dụng vào code. System prompt (theo vùng xml/sql/js/css + phần chung) nay đọc từ 5 file .txt trong thư </w:t>
+            </w:r>
+            <w:r>
+              <w:lastRenderedPageBreak/>
+              <w:t>mục Config/ cạnh exe (CompletionPromptConfig — tự sinh mặc định lần đầu chạy) thay vì hard-code, sửa file là có hiệu lực ngay không cần khởi động lại app. Cache theo 400 ký tự cuối trước con trỏ làm khóa; ghi cache TRƯỚC khi xét huỷ, và nếu Monaco huỷ request thì tự gọi lại editor.action.inlineSuggest.trigger để lần hỏi kế tiếp trúng cache ngay.</w:t>
             </w:r>
           </w:p>
         </w:tc>
@@ -4309,6 +3957,7 @@
           <w:sz w:val="24"/>
           <w:szCs w:val="24"/>
         </w:rPr>
+        <w:lastRenderedPageBreak/>
         <w:t>AI (Claude / Gemini) — các điểm gọi ra API</w:t>
       </w:r>
     </w:p>
@@ -4336,12 +3985,6 @@
         <w:gridCol w:w="2800"/>
       </w:tblGrid>
       <w:tr>
-        <w:tblPrEx>
-          <w:tblCellMar>
-            <w:top w:w="0" w:type="dxa"/>
-            <w:bottom w:w="0" w:type="dxa"/>
-          </w:tblCellMar>
-        </w:tblPrEx>
         <w:trPr>
           <w:tblHeader/>
         </w:trPr>
@@ -4364,7 +4007,6 @@
                 <w:bCs/>
                 <w:color w:val="FFFFFF"/>
               </w:rPr>
-              <w:lastRenderedPageBreak/>
               <w:t>Tính năng</w:t>
             </w:r>
           </w:p>
@@ -4440,12 +4082,6 @@
         </w:tc>
       </w:tr>
       <w:tr>
-        <w:tblPrEx>
-          <w:tblCellMar>
-            <w:top w:w="0" w:type="dxa"/>
-            <w:bottom w:w="0" w:type="dxa"/>
-          </w:tblCellMar>
-        </w:tblPrEx>
         <w:tc>
           <w:tcPr>
             <w:tcW w:w="1778" w:type="dxa"/>
@@ -4512,12 +4148,6 @@
         </w:tc>
       </w:tr>
       <w:tr>
-        <w:tblPrEx>
-          <w:tblCellMar>
-            <w:top w:w="0" w:type="dxa"/>
-            <w:bottom w:w="0" w:type="dxa"/>
-          </w:tblCellMar>
-        </w:tblPrEx>
         <w:tc>
           <w:tcPr>
             <w:tcW w:w="1778" w:type="dxa"/>
@@ -4588,12 +4218,6 @@
         </w:tc>
       </w:tr>
       <w:tr>
-        <w:tblPrEx>
-          <w:tblCellMar>
-            <w:top w:w="0" w:type="dxa"/>
-            <w:bottom w:w="0" w:type="dxa"/>
-          </w:tblCellMar>
-        </w:tblPrEx>
         <w:tc>
           <w:tcPr>
             <w:tcW w:w="1778" w:type="dxa"/>
@@ -4660,12 +4284,6 @@
         </w:tc>
       </w:tr>
       <w:tr>
-        <w:tblPrEx>
-          <w:tblCellMar>
-            <w:top w:w="0" w:type="dxa"/>
-            <w:bottom w:w="0" w:type="dxa"/>
-          </w:tblCellMar>
-        </w:tblPrEx>
         <w:tc>
           <w:tcPr>
             <w:tcW w:w="1778" w:type="dxa"/>
@@ -4679,6 +4297,7 @@
           </w:tcPr>
           <w:p>
             <w:r>
+              <w:lastRenderedPageBreak/>
               <w:t>Lưu gợi ý AI vừa dùng thành Hint Code</w:t>
             </w:r>
           </w:p>
@@ -4736,12 +4355,6 @@
         </w:tc>
       </w:tr>
       <w:tr>
-        <w:tblPrEx>
-          <w:tblCellMar>
-            <w:top w:w="0" w:type="dxa"/>
-            <w:bottom w:w="0" w:type="dxa"/>
-          </w:tblCellMar>
-        </w:tblPrEx>
         <w:tc>
           <w:tcPr>
             <w:tcW w:w="1778" w:type="dxa"/>
@@ -4818,11 +4431,7 @@
           </w:p>
           <w:p>
             <w:r>
-              <w:t xml:space="preserve">Vẫn CHƯA có ô Workspace ID riêng — key loại multi-workspace (cần header </w:t>
-            </w:r>
-            <w:r>
-              <w:lastRenderedPageBreak/>
-              <w:t>anthropic-workspace-id) vẫn phải tạo sẵn scope theo 1 workspace cụ thể trong Console thay vì nhập ở đây. Việc chỉnh system prompt AI KHÔNG nằm trong SettingsForm — sửa trực tiếp file .txt trong thư mục Config/ (xem CompletionPromptConfig ở bảng IntelliSense).</w:t>
+              <w:t>Vẫn CHƯA có ô Workspace ID riêng — key loại multi-workspace (cần header anthropic-workspace-id) vẫn phải tạo sẵn scope theo 1 workspace cụ thể trong Console thay vì nhập ở đây. Việc chỉnh system prompt AI KHÔNG nằm trong SettingsForm — sửa trực tiếp file .txt trong thư mục Config/ (xem CompletionPromptConfig ở bảng IntelliSense).</w:t>
             </w:r>
           </w:p>
         </w:tc>
@@ -4840,7 +4449,6 @@
           <w:sz w:val="24"/>
           <w:szCs w:val="24"/>
         </w:rPr>
-        <w:lastRenderedPageBreak/>
         <w:t>Cầu nối host ↔ JS</w:t>
       </w:r>
     </w:p>
@@ -4874,6 +4482,7 @@
           <w:b/>
           <w:bCs/>
         </w:rPr>
+        <w:lastRenderedPageBreak/>
         <w:t xml:space="preserve">BeginReadFile / BeginWriteFile </w:t>
       </w:r>
       <w:r>
@@ -5077,7 +4686,6 @@
           <w:b/>
           <w:bCs/>
         </w:rPr>
-        <w:lastRenderedPageBreak/>
         <w:t xml:space="preserve">Forms/QuickOpenForm.cs </w:t>
       </w:r>
       <w:r>
@@ -5344,519 +4952,6 @@
           <w:sz w:val="17"/>
           <w:szCs w:val="17"/>
         </w:rPr>
-        <w:t xml:space="preserve">│   </w:t>
-      </w:r>
-      <w:r>
-        <w:rPr>
-          <w:color w:val="333333"/>
-          <w:sz w:val="17"/>
-          <w:szCs w:val="17"/>
-        </w:rPr>
-        <w:t>├── FileReferenceControl.cs       File Reference</w:t>
-      </w:r>
-    </w:p>
-    <w:p>
-      <w:r>
-        <w:rPr>
-          <w:rFonts w:ascii="DejaVu Sans Mono" w:eastAsia="DejaVu Sans Mono" w:hAnsi="DejaVu Sans Mono" w:cs="DejaVu Sans Mono"/>
-          <w:color w:val="333333"/>
-          <w:sz w:val="17"/>
-          <w:szCs w:val="17"/>
-        </w:rPr>
-        <w:t xml:space="preserve">│   </w:t>
-      </w:r>
-      <w:r>
-        <w:rPr>
-          <w:color w:val="333333"/>
-          <w:sz w:val="17"/>
-          <w:szCs w:val="17"/>
-        </w:rPr>
-        <w:t>├── NoteControl.cs                Note</w:t>
-      </w:r>
-    </w:p>
-    <w:p>
-      <w:r>
-        <w:rPr>
-          <w:rFonts w:ascii="DejaVu Sans Mono" w:eastAsia="DejaVu Sans Mono" w:hAnsi="DejaVu Sans Mono" w:cs="DejaVu Sans Mono"/>
-          <w:color w:val="333333"/>
-          <w:sz w:val="17"/>
-          <w:szCs w:val="17"/>
-        </w:rPr>
-        <w:t xml:space="preserve">│   </w:t>
-      </w:r>
-      <w:r>
-        <w:rPr>
-          <w:color w:val="333333"/>
-          <w:sz w:val="17"/>
-          <w:szCs w:val="17"/>
-        </w:rPr>
-        <w:t>├── SqlObjectTreeControl.cs       Cây SQL Object (icon trái)</w:t>
-      </w:r>
-    </w:p>
-    <w:p>
-      <w:r>
-        <w:rPr>
-          <w:rFonts w:ascii="DejaVu Sans Mono" w:eastAsia="DejaVu Sans Mono" w:hAnsi="DejaVu Sans Mono" w:cs="DejaVu Sans Mono"/>
-          <w:color w:val="333333"/>
-          <w:sz w:val="17"/>
-          <w:szCs w:val="17"/>
-        </w:rPr>
-        <w:t xml:space="preserve">│   </w:t>
-      </w:r>
-      <w:r>
-        <w:rPr>
-          <w:color w:val="333333"/>
-          <w:sz w:val="17"/>
-          <w:szCs w:val="17"/>
-        </w:rPr>
-        <w:t>├── WCommandTreeControl.cs        Cây WCommand (icon trái)</w:t>
-      </w:r>
-    </w:p>
-    <w:p>
-      <w:r>
-        <w:rPr>
-          <w:rFonts w:ascii="DejaVu Sans Mono" w:eastAsia="DejaVu Sans Mono" w:hAnsi="DejaVu Sans Mono" w:cs="DejaVu Sans Mono"/>
-          <w:color w:val="333333"/>
-          <w:sz w:val="17"/>
-          <w:szCs w:val="17"/>
-        </w:rPr>
-        <w:t xml:space="preserve">│   </w:t>
-      </w:r>
-      <w:r>
-        <w:rPr>
-          <w:color w:val="333333"/>
-          <w:sz w:val="17"/>
-          <w:szCs w:val="17"/>
-        </w:rPr>
-        <w:t>├── SqlProfilerControl.cs         SQL Profiler  [mới]</w:t>
-      </w:r>
-    </w:p>
-    <w:p>
-      <w:r>
-        <w:rPr>
-          <w:rFonts w:ascii="DejaVu Sans Mono" w:eastAsia="DejaVu Sans Mono" w:hAnsi="DejaVu Sans Mono" w:cs="DejaVu Sans Mono"/>
-          <w:color w:val="333333"/>
-          <w:sz w:val="17"/>
-          <w:szCs w:val="17"/>
-        </w:rPr>
-        <w:t xml:space="preserve">│   </w:t>
-      </w:r>
-      <w:r>
-        <w:rPr>
-          <w:color w:val="333333"/>
-          <w:sz w:val="17"/>
-          <w:szCs w:val="17"/>
-        </w:rPr>
-        <w:t>├── ScriptEditorControl.cs        Editor script dùng chung (giỏ script, preview File Lookup, F12/Go to...)</w:t>
-      </w:r>
-    </w:p>
-    <w:p>
-      <w:r>
-        <w:rPr>
-          <w:rFonts w:ascii="DejaVu Sans Mono" w:eastAsia="DejaVu Sans Mono" w:hAnsi="DejaVu Sans Mono" w:cs="DejaVu Sans Mono"/>
-          <w:color w:val="333333"/>
-          <w:sz w:val="17"/>
-          <w:szCs w:val="17"/>
-        </w:rPr>
-        <w:t xml:space="preserve">│   </w:t>
-      </w:r>
-      <w:r>
-        <w:rPr>
-          <w:color w:val="333333"/>
-          <w:sz w:val="17"/>
-          <w:szCs w:val="17"/>
-        </w:rPr>
-        <w:t>├── MultiResultView.cs            Hiện nhiều result set 1 lần chạy</w:t>
-      </w:r>
-    </w:p>
-    <w:p>
-      <w:r>
-        <w:rPr>
-          <w:rFonts w:ascii="DejaVu Sans Mono" w:eastAsia="DejaVu Sans Mono" w:hAnsi="DejaVu Sans Mono" w:cs="DejaVu Sans Mono"/>
-          <w:color w:val="333333"/>
-          <w:sz w:val="17"/>
-          <w:szCs w:val="17"/>
-        </w:rPr>
-        <w:t xml:space="preserve">│   </w:t>
-      </w:r>
-      <w:r>
-        <w:rPr>
-          <w:color w:val="333333"/>
-          <w:sz w:val="17"/>
-          <w:szCs w:val="17"/>
-        </w:rPr>
-        <w:t>├── ResultGridMenu.cs             Menu chuột phải trên kết quả query  [mới]</w:t>
-      </w:r>
-    </w:p>
-    <w:p>
-      <w:r>
-        <w:rPr>
-          <w:rFonts w:ascii="DejaVu Sans Mono" w:eastAsia="DejaVu Sans Mono" w:hAnsi="DejaVu Sans Mono" w:cs="DejaVu Sans Mono"/>
-          <w:color w:val="333333"/>
-          <w:sz w:val="17"/>
-          <w:szCs w:val="17"/>
-        </w:rPr>
-        <w:t xml:space="preserve">│   </w:t>
-      </w:r>
-      <w:r>
-        <w:rPr>
-          <w:color w:val="333333"/>
-          <w:sz w:val="17"/>
-          <w:szCs w:val="17"/>
-        </w:rPr>
-        <w:t>├── SqlSyntaxHighlighter.cs       Tô màu cú pháp SQL nền cho RichTextBox</w:t>
-      </w:r>
-    </w:p>
-    <w:p>
-      <w:r>
-        <w:rPr>
-          <w:rFonts w:ascii="DejaVu Sans Mono" w:eastAsia="DejaVu Sans Mono" w:hAnsi="DejaVu Sans Mono" w:cs="DejaVu Sans Mono"/>
-          <w:color w:val="333333"/>
-          <w:sz w:val="17"/>
-          <w:szCs w:val="17"/>
-        </w:rPr>
-        <w:t xml:space="preserve">│   </w:t>
-      </w:r>
-      <w:r>
-        <w:rPr>
-          <w:color w:val="333333"/>
-          <w:sz w:val="17"/>
-          <w:szCs w:val="17"/>
-        </w:rPr>
-        <w:t>├── SuggestPopup.cs               Popup gợi ý autocomplete dùng chung</w:t>
-      </w:r>
-    </w:p>
-    <w:p>
-      <w:r>
-        <w:rPr>
-          <w:rFonts w:ascii="DejaVu Sans Mono" w:eastAsia="DejaVu Sans Mono" w:hAnsi="DejaVu Sans Mono" w:cs="DejaVu Sans Mono"/>
-          <w:color w:val="333333"/>
-          <w:sz w:val="17"/>
-          <w:szCs w:val="17"/>
-        </w:rPr>
-        <w:t xml:space="preserve">│   </w:t>
-      </w:r>
-      <w:r>
-        <w:rPr>
-          <w:color w:val="333333"/>
-          <w:sz w:val="17"/>
-          <w:szCs w:val="17"/>
-        </w:rPr>
-        <w:t>├── UndoRedoTracker.cs            Undo/Redo tự viết (RichTextBox tô màu phá undo mặc định)</w:t>
-      </w:r>
-    </w:p>
-    <w:p>
-      <w:r>
-        <w:rPr>
-          <w:rFonts w:ascii="DejaVu Sans Mono" w:eastAsia="DejaVu Sans Mono" w:hAnsi="DejaVu Sans Mono" w:cs="DejaVu Sans Mono"/>
-          <w:color w:val="333333"/>
-          <w:sz w:val="17"/>
-          <w:szCs w:val="17"/>
-        </w:rPr>
-        <w:t xml:space="preserve">│   </w:t>
-      </w:r>
-      <w:r>
-        <w:rPr>
-          <w:color w:val="333333"/>
-          <w:sz w:val="17"/>
-          <w:szCs w:val="17"/>
-        </w:rPr>
-        <w:t>├── IconRailControl.cs            Host HTML cột icon trái</w:t>
-      </w:r>
-    </w:p>
-    <w:p>
-      <w:r>
-        <w:rPr>
-          <w:rFonts w:ascii="DejaVu Sans Mono" w:eastAsia="DejaVu Sans Mono" w:hAnsi="DejaVu Sans Mono" w:cs="DejaVu Sans Mono"/>
-          <w:color w:val="333333"/>
-          <w:sz w:val="17"/>
-          <w:szCs w:val="17"/>
-        </w:rPr>
-        <w:t xml:space="preserve">│   </w:t>
-      </w:r>
-      <w:r>
-        <w:rPr>
-          <w:color w:val="333333"/>
-          <w:sz w:val="17"/>
-          <w:szCs w:val="17"/>
-        </w:rPr>
-        <w:t>└── WebActionBar.cs, WebBarHost.cs, WebMenu.cs, PillButton.cs   Hạ tầng thanh HTML &amp; nút dùng chung</w:t>
-      </w:r>
-    </w:p>
-    <w:p>
-      <w:r>
-        <w:rPr>
-          <w:rFonts w:ascii="DejaVu Sans Mono" w:eastAsia="DejaVu Sans Mono" w:hAnsi="DejaVu Sans Mono" w:cs="DejaVu Sans Mono"/>
-          <w:color w:val="333333"/>
-          <w:sz w:val="17"/>
-          <w:szCs w:val="17"/>
-        </w:rPr>
-        <w:t xml:space="preserve">├── Forms/  </w:t>
-      </w:r>
-      <w:r>
-        <w:rPr>
-          <w:color w:val="333333"/>
-          <w:sz w:val="17"/>
-          <w:szCs w:val="17"/>
-        </w:rPr>
-        <w:t>(27 file) — dialog/cửa sổ độc lập</w:t>
-      </w:r>
-    </w:p>
-    <w:p>
-      <w:r>
-        <w:rPr>
-          <w:rFonts w:ascii="DejaVu Sans Mono" w:eastAsia="DejaVu Sans Mono" w:hAnsi="DejaVu Sans Mono" w:cs="DejaVu Sans Mono"/>
-          <w:color w:val="333333"/>
-          <w:sz w:val="17"/>
-          <w:szCs w:val="17"/>
-        </w:rPr>
-        <w:t xml:space="preserve">│   </w:t>
-      </w:r>
-      <w:r>
-        <w:rPr>
-          <w:color w:val="333333"/>
-          <w:sz w:val="17"/>
-          <w:szCs w:val="17"/>
-        </w:rPr>
-        <w:t>├── MainForm.cs                   Cửa sổ chính — dựng mọi service trong constructor</w:t>
-      </w:r>
-    </w:p>
-    <w:p>
-      <w:r>
-        <w:rPr>
-          <w:rFonts w:ascii="DejaVu Sans Mono" w:eastAsia="DejaVu Sans Mono" w:hAnsi="DejaVu Sans Mono" w:cs="DejaVu Sans Mono"/>
-          <w:color w:val="333333"/>
-          <w:sz w:val="17"/>
-          <w:szCs w:val="17"/>
-        </w:rPr>
-        <w:t xml:space="preserve">│   </w:t>
-      </w:r>
-      <w:r>
-        <w:rPr>
-          <w:color w:val="333333"/>
-          <w:sz w:val="17"/>
-          <w:szCs w:val="17"/>
-        </w:rPr>
-        <w:t>├── ConnectionSettingsForm.cs     Chọn Server/Workspace</w:t>
-      </w:r>
-    </w:p>
-    <w:p>
-      <w:r>
-        <w:rPr>
-          <w:rFonts w:ascii="DejaVu Sans Mono" w:eastAsia="DejaVu Sans Mono" w:hAnsi="DejaVu Sans Mono" w:cs="DejaVu Sans Mono"/>
-          <w:color w:val="333333"/>
-          <w:sz w:val="17"/>
-          <w:szCs w:val="17"/>
-        </w:rPr>
-        <w:t xml:space="preserve">│   </w:t>
-      </w:r>
-      <w:r>
-        <w:rPr>
-          <w:color w:val="333333"/>
-          <w:sz w:val="17"/>
-          <w:szCs w:val="17"/>
-        </w:rPr>
-        <w:t>├── QuickAccessForm.cs, EditProjectForm.cs</w:t>
-      </w:r>
-    </w:p>
-    <w:p>
-      <w:r>
-        <w:rPr>
-          <w:rFonts w:ascii="DejaVu Sans Mono" w:eastAsia="DejaVu Sans Mono" w:hAnsi="DejaVu Sans Mono" w:cs="DejaVu Sans Mono"/>
-          <w:color w:val="333333"/>
-          <w:sz w:val="17"/>
-          <w:szCs w:val="17"/>
-        </w:rPr>
-        <w:t xml:space="preserve">│   </w:t>
-      </w:r>
-      <w:r>
-        <w:rPr>
-          <w:color w:val="333333"/>
-          <w:sz w:val="17"/>
-          <w:szCs w:val="17"/>
-        </w:rPr>
-        <w:t>├── ChangeOwnerForm.cs, CompareStructureForm.cs, LibrarySnippetForm.cs</w:t>
-      </w:r>
-    </w:p>
-    <w:p>
-      <w:r>
-        <w:rPr>
-          <w:rFonts w:ascii="DejaVu Sans Mono" w:eastAsia="DejaVu Sans Mono" w:hAnsi="DejaVu Sans Mono" w:cs="DejaVu Sans Mono"/>
-          <w:color w:val="333333"/>
-          <w:sz w:val="17"/>
-          <w:szCs w:val="17"/>
-        </w:rPr>
-        <w:t xml:space="preserve">│   </w:t>
-      </w:r>
-      <w:r>
-        <w:rPr>
-          <w:color w:val="333333"/>
-          <w:sz w:val="17"/>
-          <w:szCs w:val="17"/>
-        </w:rPr>
-        <w:t>├── StringBeautyForm.cs           (nay dùng Services/SqlFormatterService.cs)</w:t>
-      </w:r>
-    </w:p>
-    <w:p>
-      <w:r>
-        <w:rPr>
-          <w:rFonts w:ascii="DejaVu Sans Mono" w:eastAsia="DejaVu Sans Mono" w:hAnsi="DejaVu Sans Mono" w:cs="DejaVu Sans Mono"/>
-          <w:color w:val="333333"/>
-          <w:sz w:val="17"/>
-          <w:szCs w:val="17"/>
-        </w:rPr>
-        <w:t xml:space="preserve">│   </w:t>
-      </w:r>
-      <w:r>
-        <w:rPr>
-          <w:color w:val="333333"/>
-          <w:sz w:val="17"/>
-          <w:szCs w:val="17"/>
-        </w:rPr>
-        <w:t>├── DecryptSqlObjectForm.cs       (engine giải mã thật, DAC)</w:t>
-      </w:r>
-    </w:p>
-    <w:p>
-      <w:r>
-        <w:rPr>
-          <w:rFonts w:ascii="DejaVu Sans Mono" w:eastAsia="DejaVu Sans Mono" w:hAnsi="DejaVu Sans Mono" w:cs="DejaVu Sans Mono"/>
-          <w:color w:val="333333"/>
-          <w:sz w:val="17"/>
-          <w:szCs w:val="17"/>
-        </w:rPr>
-        <w:t xml:space="preserve">│   </w:t>
-      </w:r>
-      <w:r>
-        <w:rPr>
-          <w:color w:val="333333"/>
-          <w:sz w:val="17"/>
-          <w:szCs w:val="17"/>
-        </w:rPr>
-        <w:t>├── SetupEInvoiceForm.cs, CreateRptXlsxForm.cs</w:t>
-      </w:r>
-    </w:p>
-    <w:p>
-      <w:r>
-        <w:rPr>
-          <w:rFonts w:ascii="DejaVu Sans Mono" w:eastAsia="DejaVu Sans Mono" w:hAnsi="DejaVu Sans Mono" w:cs="DejaVu Sans Mono"/>
-          <w:color w:val="333333"/>
-          <w:sz w:val="17"/>
-          <w:szCs w:val="17"/>
-        </w:rPr>
-        <w:t xml:space="preserve">│   </w:t>
-      </w:r>
-      <w:r>
-        <w:rPr>
-          <w:color w:val="333333"/>
-          <w:sz w:val="17"/>
-          <w:szCs w:val="17"/>
-        </w:rPr>
-        <w:t>├── CompareTextForm.cs            (đổi tên từ CompareTextControl.cs)</w:t>
-      </w:r>
-    </w:p>
-    <w:p>
-      <w:r>
-        <w:rPr>
-          <w:rFonts w:ascii="DejaVu Sans Mono" w:eastAsia="DejaVu Sans Mono" w:hAnsi="DejaVu Sans Mono" w:cs="DejaVu Sans Mono"/>
-          <w:color w:val="333333"/>
-          <w:sz w:val="17"/>
-          <w:szCs w:val="17"/>
-        </w:rPr>
-        <w:t xml:space="preserve">│   </w:t>
-      </w:r>
-      <w:r>
-        <w:rPr>
-          <w:color w:val="333333"/>
-          <w:sz w:val="17"/>
-          <w:szCs w:val="17"/>
-        </w:rPr>
-        <w:t>├── ApiDeclarationForm.cs         Khai báo &amp; test API  [mới]</w:t>
-      </w:r>
-    </w:p>
-    <w:p>
-      <w:r>
-        <w:rPr>
-          <w:rFonts w:ascii="DejaVu Sans Mono" w:eastAsia="DejaVu Sans Mono" w:hAnsi="DejaVu Sans Mono" w:cs="DejaVu Sans Mono"/>
-          <w:color w:val="333333"/>
-          <w:sz w:val="17"/>
-          <w:szCs w:val="17"/>
-        </w:rPr>
-        <w:t xml:space="preserve">│   </w:t>
-      </w:r>
-      <w:r>
-        <w:rPr>
-          <w:color w:val="333333"/>
-          <w:sz w:val="17"/>
-          <w:szCs w:val="17"/>
-        </w:rPr>
-        <w:t>├── ApiSchemaBuilderForm.cs       Sinh đặc tả API ra Word  [mới]</w:t>
-      </w:r>
-    </w:p>
-    <w:p>
-      <w:r>
-        <w:rPr>
-          <w:rFonts w:ascii="DejaVu Sans Mono" w:eastAsia="DejaVu Sans Mono" w:hAnsi="DejaVu Sans Mono" w:cs="DejaVu Sans Mono"/>
-          <w:color w:val="333333"/>
-          <w:sz w:val="17"/>
-          <w:szCs w:val="17"/>
-        </w:rPr>
-        <w:t xml:space="preserve">│   </w:t>
-      </w:r>
-      <w:r>
-        <w:rPr>
-          <w:color w:val="333333"/>
-          <w:sz w:val="17"/>
-          <w:szCs w:val="17"/>
-        </w:rPr>
-        <w:t>├── CopySourceStandardForm.cs     Nhân bản file (mở từ menu WCommand)  [mới]</w:t>
-      </w:r>
-    </w:p>
-    <w:p>
-      <w:r>
-        <w:rPr>
-          <w:rFonts w:ascii="DejaVu Sans Mono" w:eastAsia="DejaVu Sans Mono" w:hAnsi="DejaVu Sans Mono" w:cs="DejaVu Sans Mono"/>
-          <w:color w:val="333333"/>
-          <w:sz w:val="17"/>
-          <w:szCs w:val="17"/>
-        </w:rPr>
-        <w:t xml:space="preserve">│   </w:t>
-      </w:r>
-      <w:r>
-        <w:rPr>
-          <w:color w:val="333333"/>
-          <w:sz w:val="17"/>
-          <w:szCs w:val="17"/>
-        </w:rPr>
-        <w:t>├── CopyFileToForm.cs             Copy file sang project khác (mở từ menu File Lookup)  [mới]</w:t>
-      </w:r>
-    </w:p>
-    <w:p>
-      <w:r>
-        <w:rPr>
-          <w:rFonts w:ascii="DejaVu Sans Mono" w:eastAsia="DejaVu Sans Mono" w:hAnsi="DejaVu Sans Mono" w:cs="DejaVu Sans Mono"/>
-          <w:color w:val="333333"/>
-          <w:sz w:val="17"/>
-          <w:szCs w:val="17"/>
-        </w:rPr>
-        <w:t xml:space="preserve">│   </w:t>
-      </w:r>
-      <w:r>
-        <w:rPr>
-          <w:color w:val="333333"/>
-          <w:sz w:val="17"/>
-          <w:szCs w:val="17"/>
-        </w:rPr>
-        <w:t>├── QuickLaunchLoginForm.cs       Auto-login FSG FBO  [mới]</w:t>
-      </w:r>
-    </w:p>
-    <w:p>
-      <w:r>
-        <w:rPr>
-          <w:rFonts w:ascii="DejaVu Sans Mono" w:eastAsia="DejaVu Sans Mono" w:hAnsi="DejaVu Sans Mono" w:cs="DejaVu Sans Mono"/>
-          <w:color w:val="333333"/>
-          <w:sz w:val="17"/>
-          <w:szCs w:val="17"/>
-        </w:rPr>
         <w:lastRenderedPageBreak/>
         <w:t xml:space="preserve">│   </w:t>
       </w:r>
@@ -5866,6 +4961,519 @@
           <w:sz w:val="17"/>
           <w:szCs w:val="17"/>
         </w:rPr>
+        <w:t>├── FileReferenceControl.cs       File Reference</w:t>
+      </w:r>
+    </w:p>
+    <w:p>
+      <w:r>
+        <w:rPr>
+          <w:rFonts w:ascii="DejaVu Sans Mono" w:eastAsia="DejaVu Sans Mono" w:hAnsi="DejaVu Sans Mono" w:cs="DejaVu Sans Mono"/>
+          <w:color w:val="333333"/>
+          <w:sz w:val="17"/>
+          <w:szCs w:val="17"/>
+        </w:rPr>
+        <w:t xml:space="preserve">│   </w:t>
+      </w:r>
+      <w:r>
+        <w:rPr>
+          <w:color w:val="333333"/>
+          <w:sz w:val="17"/>
+          <w:szCs w:val="17"/>
+        </w:rPr>
+        <w:t>├── NoteControl.cs                Note</w:t>
+      </w:r>
+    </w:p>
+    <w:p>
+      <w:r>
+        <w:rPr>
+          <w:rFonts w:ascii="DejaVu Sans Mono" w:eastAsia="DejaVu Sans Mono" w:hAnsi="DejaVu Sans Mono" w:cs="DejaVu Sans Mono"/>
+          <w:color w:val="333333"/>
+          <w:sz w:val="17"/>
+          <w:szCs w:val="17"/>
+        </w:rPr>
+        <w:t xml:space="preserve">│   </w:t>
+      </w:r>
+      <w:r>
+        <w:rPr>
+          <w:color w:val="333333"/>
+          <w:sz w:val="17"/>
+          <w:szCs w:val="17"/>
+        </w:rPr>
+        <w:t>├── SqlObjectTreeControl.cs       Cây SQL Object (icon trái)</w:t>
+      </w:r>
+    </w:p>
+    <w:p>
+      <w:r>
+        <w:rPr>
+          <w:rFonts w:ascii="DejaVu Sans Mono" w:eastAsia="DejaVu Sans Mono" w:hAnsi="DejaVu Sans Mono" w:cs="DejaVu Sans Mono"/>
+          <w:color w:val="333333"/>
+          <w:sz w:val="17"/>
+          <w:szCs w:val="17"/>
+        </w:rPr>
+        <w:t xml:space="preserve">│   </w:t>
+      </w:r>
+      <w:r>
+        <w:rPr>
+          <w:color w:val="333333"/>
+          <w:sz w:val="17"/>
+          <w:szCs w:val="17"/>
+        </w:rPr>
+        <w:t>├── WCommandTreeControl.cs        Cây WCommand (icon trái)</w:t>
+      </w:r>
+    </w:p>
+    <w:p>
+      <w:r>
+        <w:rPr>
+          <w:rFonts w:ascii="DejaVu Sans Mono" w:eastAsia="DejaVu Sans Mono" w:hAnsi="DejaVu Sans Mono" w:cs="DejaVu Sans Mono"/>
+          <w:color w:val="333333"/>
+          <w:sz w:val="17"/>
+          <w:szCs w:val="17"/>
+        </w:rPr>
+        <w:t xml:space="preserve">│   </w:t>
+      </w:r>
+      <w:r>
+        <w:rPr>
+          <w:color w:val="333333"/>
+          <w:sz w:val="17"/>
+          <w:szCs w:val="17"/>
+        </w:rPr>
+        <w:t>├── SqlProfilerControl.cs         SQL Profiler  [mới]</w:t>
+      </w:r>
+    </w:p>
+    <w:p>
+      <w:r>
+        <w:rPr>
+          <w:rFonts w:ascii="DejaVu Sans Mono" w:eastAsia="DejaVu Sans Mono" w:hAnsi="DejaVu Sans Mono" w:cs="DejaVu Sans Mono"/>
+          <w:color w:val="333333"/>
+          <w:sz w:val="17"/>
+          <w:szCs w:val="17"/>
+        </w:rPr>
+        <w:t xml:space="preserve">│   </w:t>
+      </w:r>
+      <w:r>
+        <w:rPr>
+          <w:color w:val="333333"/>
+          <w:sz w:val="17"/>
+          <w:szCs w:val="17"/>
+        </w:rPr>
+        <w:t>├── ScriptEditorControl.cs        Editor script dùng chung (giỏ script, preview File Lookup, F12/Go to...)</w:t>
+      </w:r>
+    </w:p>
+    <w:p>
+      <w:r>
+        <w:rPr>
+          <w:rFonts w:ascii="DejaVu Sans Mono" w:eastAsia="DejaVu Sans Mono" w:hAnsi="DejaVu Sans Mono" w:cs="DejaVu Sans Mono"/>
+          <w:color w:val="333333"/>
+          <w:sz w:val="17"/>
+          <w:szCs w:val="17"/>
+        </w:rPr>
+        <w:t xml:space="preserve">│   </w:t>
+      </w:r>
+      <w:r>
+        <w:rPr>
+          <w:color w:val="333333"/>
+          <w:sz w:val="17"/>
+          <w:szCs w:val="17"/>
+        </w:rPr>
+        <w:t>├── MultiResultView.cs            Hiện nhiều result set 1 lần chạy</w:t>
+      </w:r>
+    </w:p>
+    <w:p>
+      <w:r>
+        <w:rPr>
+          <w:rFonts w:ascii="DejaVu Sans Mono" w:eastAsia="DejaVu Sans Mono" w:hAnsi="DejaVu Sans Mono" w:cs="DejaVu Sans Mono"/>
+          <w:color w:val="333333"/>
+          <w:sz w:val="17"/>
+          <w:szCs w:val="17"/>
+        </w:rPr>
+        <w:t xml:space="preserve">│   </w:t>
+      </w:r>
+      <w:r>
+        <w:rPr>
+          <w:color w:val="333333"/>
+          <w:sz w:val="17"/>
+          <w:szCs w:val="17"/>
+        </w:rPr>
+        <w:t>├── ResultGridMenu.cs             Menu chuột phải trên kết quả query  [mới]</w:t>
+      </w:r>
+    </w:p>
+    <w:p>
+      <w:r>
+        <w:rPr>
+          <w:rFonts w:ascii="DejaVu Sans Mono" w:eastAsia="DejaVu Sans Mono" w:hAnsi="DejaVu Sans Mono" w:cs="DejaVu Sans Mono"/>
+          <w:color w:val="333333"/>
+          <w:sz w:val="17"/>
+          <w:szCs w:val="17"/>
+        </w:rPr>
+        <w:t xml:space="preserve">│   </w:t>
+      </w:r>
+      <w:r>
+        <w:rPr>
+          <w:color w:val="333333"/>
+          <w:sz w:val="17"/>
+          <w:szCs w:val="17"/>
+        </w:rPr>
+        <w:t>├── SqlSyntaxHighlighter.cs       Tô màu cú pháp SQL nền cho RichTextBox</w:t>
+      </w:r>
+    </w:p>
+    <w:p>
+      <w:r>
+        <w:rPr>
+          <w:rFonts w:ascii="DejaVu Sans Mono" w:eastAsia="DejaVu Sans Mono" w:hAnsi="DejaVu Sans Mono" w:cs="DejaVu Sans Mono"/>
+          <w:color w:val="333333"/>
+          <w:sz w:val="17"/>
+          <w:szCs w:val="17"/>
+        </w:rPr>
+        <w:t xml:space="preserve">│   </w:t>
+      </w:r>
+      <w:r>
+        <w:rPr>
+          <w:color w:val="333333"/>
+          <w:sz w:val="17"/>
+          <w:szCs w:val="17"/>
+        </w:rPr>
+        <w:t>├── SuggestPopup.cs               Popup gợi ý autocomplete dùng chung</w:t>
+      </w:r>
+    </w:p>
+    <w:p>
+      <w:r>
+        <w:rPr>
+          <w:rFonts w:ascii="DejaVu Sans Mono" w:eastAsia="DejaVu Sans Mono" w:hAnsi="DejaVu Sans Mono" w:cs="DejaVu Sans Mono"/>
+          <w:color w:val="333333"/>
+          <w:sz w:val="17"/>
+          <w:szCs w:val="17"/>
+        </w:rPr>
+        <w:t xml:space="preserve">│   </w:t>
+      </w:r>
+      <w:r>
+        <w:rPr>
+          <w:color w:val="333333"/>
+          <w:sz w:val="17"/>
+          <w:szCs w:val="17"/>
+        </w:rPr>
+        <w:t>├── UndoRedoTracker.cs            Undo/Redo tự viết (RichTextBox tô màu phá undo mặc định)</w:t>
+      </w:r>
+    </w:p>
+    <w:p>
+      <w:r>
+        <w:rPr>
+          <w:rFonts w:ascii="DejaVu Sans Mono" w:eastAsia="DejaVu Sans Mono" w:hAnsi="DejaVu Sans Mono" w:cs="DejaVu Sans Mono"/>
+          <w:color w:val="333333"/>
+          <w:sz w:val="17"/>
+          <w:szCs w:val="17"/>
+        </w:rPr>
+        <w:t xml:space="preserve">│   </w:t>
+      </w:r>
+      <w:r>
+        <w:rPr>
+          <w:color w:val="333333"/>
+          <w:sz w:val="17"/>
+          <w:szCs w:val="17"/>
+        </w:rPr>
+        <w:t>├── IconRailControl.cs            Host HTML cột icon trái</w:t>
+      </w:r>
+    </w:p>
+    <w:p>
+      <w:r>
+        <w:rPr>
+          <w:rFonts w:ascii="DejaVu Sans Mono" w:eastAsia="DejaVu Sans Mono" w:hAnsi="DejaVu Sans Mono" w:cs="DejaVu Sans Mono"/>
+          <w:color w:val="333333"/>
+          <w:sz w:val="17"/>
+          <w:szCs w:val="17"/>
+        </w:rPr>
+        <w:t xml:space="preserve">│   </w:t>
+      </w:r>
+      <w:r>
+        <w:rPr>
+          <w:color w:val="333333"/>
+          <w:sz w:val="17"/>
+          <w:szCs w:val="17"/>
+        </w:rPr>
+        <w:t>└── WebActionBar.cs, WebBarHost.cs, WebMenu.cs, PillButton.cs   Hạ tầng thanh HTML &amp; nút dùng chung</w:t>
+      </w:r>
+    </w:p>
+    <w:p>
+      <w:r>
+        <w:rPr>
+          <w:rFonts w:ascii="DejaVu Sans Mono" w:eastAsia="DejaVu Sans Mono" w:hAnsi="DejaVu Sans Mono" w:cs="DejaVu Sans Mono"/>
+          <w:color w:val="333333"/>
+          <w:sz w:val="17"/>
+          <w:szCs w:val="17"/>
+        </w:rPr>
+        <w:t xml:space="preserve">├── Forms/  </w:t>
+      </w:r>
+      <w:r>
+        <w:rPr>
+          <w:color w:val="333333"/>
+          <w:sz w:val="17"/>
+          <w:szCs w:val="17"/>
+        </w:rPr>
+        <w:t>(27 file) — dialog/cửa sổ độc lập</w:t>
+      </w:r>
+    </w:p>
+    <w:p>
+      <w:r>
+        <w:rPr>
+          <w:rFonts w:ascii="DejaVu Sans Mono" w:eastAsia="DejaVu Sans Mono" w:hAnsi="DejaVu Sans Mono" w:cs="DejaVu Sans Mono"/>
+          <w:color w:val="333333"/>
+          <w:sz w:val="17"/>
+          <w:szCs w:val="17"/>
+        </w:rPr>
+        <w:t xml:space="preserve">│   </w:t>
+      </w:r>
+      <w:r>
+        <w:rPr>
+          <w:color w:val="333333"/>
+          <w:sz w:val="17"/>
+          <w:szCs w:val="17"/>
+        </w:rPr>
+        <w:t>├── MainForm.cs                   Cửa sổ chính — dựng mọi service trong constructor</w:t>
+      </w:r>
+    </w:p>
+    <w:p>
+      <w:r>
+        <w:rPr>
+          <w:rFonts w:ascii="DejaVu Sans Mono" w:eastAsia="DejaVu Sans Mono" w:hAnsi="DejaVu Sans Mono" w:cs="DejaVu Sans Mono"/>
+          <w:color w:val="333333"/>
+          <w:sz w:val="17"/>
+          <w:szCs w:val="17"/>
+        </w:rPr>
+        <w:t xml:space="preserve">│   </w:t>
+      </w:r>
+      <w:r>
+        <w:rPr>
+          <w:color w:val="333333"/>
+          <w:sz w:val="17"/>
+          <w:szCs w:val="17"/>
+        </w:rPr>
+        <w:t>├── ConnectionSettingsForm.cs     Chọn Server/Workspace</w:t>
+      </w:r>
+    </w:p>
+    <w:p>
+      <w:r>
+        <w:rPr>
+          <w:rFonts w:ascii="DejaVu Sans Mono" w:eastAsia="DejaVu Sans Mono" w:hAnsi="DejaVu Sans Mono" w:cs="DejaVu Sans Mono"/>
+          <w:color w:val="333333"/>
+          <w:sz w:val="17"/>
+          <w:szCs w:val="17"/>
+        </w:rPr>
+        <w:t xml:space="preserve">│   </w:t>
+      </w:r>
+      <w:r>
+        <w:rPr>
+          <w:color w:val="333333"/>
+          <w:sz w:val="17"/>
+          <w:szCs w:val="17"/>
+        </w:rPr>
+        <w:t>├── QuickAccessForm.cs, EditProjectForm.cs</w:t>
+      </w:r>
+    </w:p>
+    <w:p>
+      <w:r>
+        <w:rPr>
+          <w:rFonts w:ascii="DejaVu Sans Mono" w:eastAsia="DejaVu Sans Mono" w:hAnsi="DejaVu Sans Mono" w:cs="DejaVu Sans Mono"/>
+          <w:color w:val="333333"/>
+          <w:sz w:val="17"/>
+          <w:szCs w:val="17"/>
+        </w:rPr>
+        <w:t xml:space="preserve">│   </w:t>
+      </w:r>
+      <w:r>
+        <w:rPr>
+          <w:color w:val="333333"/>
+          <w:sz w:val="17"/>
+          <w:szCs w:val="17"/>
+        </w:rPr>
+        <w:t>├── ChangeOwnerForm.cs, CompareStructureForm.cs, LibrarySnippetForm.cs</w:t>
+      </w:r>
+    </w:p>
+    <w:p>
+      <w:r>
+        <w:rPr>
+          <w:rFonts w:ascii="DejaVu Sans Mono" w:eastAsia="DejaVu Sans Mono" w:hAnsi="DejaVu Sans Mono" w:cs="DejaVu Sans Mono"/>
+          <w:color w:val="333333"/>
+          <w:sz w:val="17"/>
+          <w:szCs w:val="17"/>
+        </w:rPr>
+        <w:t xml:space="preserve">│   </w:t>
+      </w:r>
+      <w:r>
+        <w:rPr>
+          <w:color w:val="333333"/>
+          <w:sz w:val="17"/>
+          <w:szCs w:val="17"/>
+        </w:rPr>
+        <w:t>├── StringBeautyForm.cs           (nay dùng Services/SqlFormatterService.cs)</w:t>
+      </w:r>
+    </w:p>
+    <w:p>
+      <w:r>
+        <w:rPr>
+          <w:rFonts w:ascii="DejaVu Sans Mono" w:eastAsia="DejaVu Sans Mono" w:hAnsi="DejaVu Sans Mono" w:cs="DejaVu Sans Mono"/>
+          <w:color w:val="333333"/>
+          <w:sz w:val="17"/>
+          <w:szCs w:val="17"/>
+        </w:rPr>
+        <w:t xml:space="preserve">│   </w:t>
+      </w:r>
+      <w:r>
+        <w:rPr>
+          <w:color w:val="333333"/>
+          <w:sz w:val="17"/>
+          <w:szCs w:val="17"/>
+        </w:rPr>
+        <w:t>├── DecryptSqlObjectForm.cs       (engine giải mã thật, DAC)</w:t>
+      </w:r>
+    </w:p>
+    <w:p>
+      <w:r>
+        <w:rPr>
+          <w:rFonts w:ascii="DejaVu Sans Mono" w:eastAsia="DejaVu Sans Mono" w:hAnsi="DejaVu Sans Mono" w:cs="DejaVu Sans Mono"/>
+          <w:color w:val="333333"/>
+          <w:sz w:val="17"/>
+          <w:szCs w:val="17"/>
+        </w:rPr>
+        <w:t xml:space="preserve">│   </w:t>
+      </w:r>
+      <w:r>
+        <w:rPr>
+          <w:color w:val="333333"/>
+          <w:sz w:val="17"/>
+          <w:szCs w:val="17"/>
+        </w:rPr>
+        <w:t>├── SetupEInvoiceForm.cs, CreateRptXlsxForm.cs</w:t>
+      </w:r>
+    </w:p>
+    <w:p>
+      <w:r>
+        <w:rPr>
+          <w:rFonts w:ascii="DejaVu Sans Mono" w:eastAsia="DejaVu Sans Mono" w:hAnsi="DejaVu Sans Mono" w:cs="DejaVu Sans Mono"/>
+          <w:color w:val="333333"/>
+          <w:sz w:val="17"/>
+          <w:szCs w:val="17"/>
+        </w:rPr>
+        <w:t xml:space="preserve">│   </w:t>
+      </w:r>
+      <w:r>
+        <w:rPr>
+          <w:color w:val="333333"/>
+          <w:sz w:val="17"/>
+          <w:szCs w:val="17"/>
+        </w:rPr>
+        <w:t>├── CompareTextForm.cs            (đổi tên từ CompareTextControl.cs)</w:t>
+      </w:r>
+    </w:p>
+    <w:p>
+      <w:r>
+        <w:rPr>
+          <w:rFonts w:ascii="DejaVu Sans Mono" w:eastAsia="DejaVu Sans Mono" w:hAnsi="DejaVu Sans Mono" w:cs="DejaVu Sans Mono"/>
+          <w:color w:val="333333"/>
+          <w:sz w:val="17"/>
+          <w:szCs w:val="17"/>
+        </w:rPr>
+        <w:t xml:space="preserve">│   </w:t>
+      </w:r>
+      <w:r>
+        <w:rPr>
+          <w:color w:val="333333"/>
+          <w:sz w:val="17"/>
+          <w:szCs w:val="17"/>
+        </w:rPr>
+        <w:t>├── ApiDeclarationForm.cs         Khai báo &amp; test API  [mới]</w:t>
+      </w:r>
+    </w:p>
+    <w:p>
+      <w:r>
+        <w:rPr>
+          <w:rFonts w:ascii="DejaVu Sans Mono" w:eastAsia="DejaVu Sans Mono" w:hAnsi="DejaVu Sans Mono" w:cs="DejaVu Sans Mono"/>
+          <w:color w:val="333333"/>
+          <w:sz w:val="17"/>
+          <w:szCs w:val="17"/>
+        </w:rPr>
+        <w:t xml:space="preserve">│   </w:t>
+      </w:r>
+      <w:r>
+        <w:rPr>
+          <w:color w:val="333333"/>
+          <w:sz w:val="17"/>
+          <w:szCs w:val="17"/>
+        </w:rPr>
+        <w:t>├── ApiSchemaBuilderForm.cs       Sinh đặc tả API ra Word  [mới]</w:t>
+      </w:r>
+    </w:p>
+    <w:p>
+      <w:r>
+        <w:rPr>
+          <w:rFonts w:ascii="DejaVu Sans Mono" w:eastAsia="DejaVu Sans Mono" w:hAnsi="DejaVu Sans Mono" w:cs="DejaVu Sans Mono"/>
+          <w:color w:val="333333"/>
+          <w:sz w:val="17"/>
+          <w:szCs w:val="17"/>
+        </w:rPr>
+        <w:t xml:space="preserve">│   </w:t>
+      </w:r>
+      <w:r>
+        <w:rPr>
+          <w:color w:val="333333"/>
+          <w:sz w:val="17"/>
+          <w:szCs w:val="17"/>
+        </w:rPr>
+        <w:t>├── CopySourceStandardForm.cs     Nhân bản file (mở từ menu WCommand)  [mới]</w:t>
+      </w:r>
+    </w:p>
+    <w:p>
+      <w:r>
+        <w:rPr>
+          <w:rFonts w:ascii="DejaVu Sans Mono" w:eastAsia="DejaVu Sans Mono" w:hAnsi="DejaVu Sans Mono" w:cs="DejaVu Sans Mono"/>
+          <w:color w:val="333333"/>
+          <w:sz w:val="17"/>
+          <w:szCs w:val="17"/>
+        </w:rPr>
+        <w:t xml:space="preserve">│   </w:t>
+      </w:r>
+      <w:r>
+        <w:rPr>
+          <w:color w:val="333333"/>
+          <w:sz w:val="17"/>
+          <w:szCs w:val="17"/>
+        </w:rPr>
+        <w:t>├── CopyFileToForm.cs             Copy file sang project khác (mở từ menu File Lookup)  [mới]</w:t>
+      </w:r>
+    </w:p>
+    <w:p>
+      <w:r>
+        <w:rPr>
+          <w:rFonts w:ascii="DejaVu Sans Mono" w:eastAsia="DejaVu Sans Mono" w:hAnsi="DejaVu Sans Mono" w:cs="DejaVu Sans Mono"/>
+          <w:color w:val="333333"/>
+          <w:sz w:val="17"/>
+          <w:szCs w:val="17"/>
+        </w:rPr>
+        <w:t xml:space="preserve">│   </w:t>
+      </w:r>
+      <w:r>
+        <w:rPr>
+          <w:color w:val="333333"/>
+          <w:sz w:val="17"/>
+          <w:szCs w:val="17"/>
+        </w:rPr>
+        <w:t>├── QuickLaunchLoginForm.cs       Auto-login FSG FBO  [mới]</w:t>
+      </w:r>
+    </w:p>
+    <w:p>
+      <w:r>
+        <w:rPr>
+          <w:rFonts w:ascii="DejaVu Sans Mono" w:eastAsia="DejaVu Sans Mono" w:hAnsi="DejaVu Sans Mono" w:cs="DejaVu Sans Mono"/>
+          <w:color w:val="333333"/>
+          <w:sz w:val="17"/>
+          <w:szCs w:val="17"/>
+        </w:rPr>
+        <w:t xml:space="preserve">│   </w:t>
+      </w:r>
+      <w:r>
+        <w:rPr>
+          <w:color w:val="333333"/>
+          <w:sz w:val="17"/>
+          <w:szCs w:val="17"/>
+        </w:rPr>
         <w:t>├── FsgRequirementCrawlerForm.cs  FSG Yêu cầu  [mới]</w:t>
       </w:r>
     </w:p>
@@ -6409,6 +6017,7 @@
           <w:sz w:val="17"/>
           <w:szCs w:val="17"/>
         </w:rPr>
+        <w:lastRenderedPageBreak/>
         <w:t xml:space="preserve">│   </w:t>
       </w:r>
       <w:r>
@@ -6842,7 +6451,6 @@
           <w:sz w:val="17"/>
           <w:szCs w:val="17"/>
         </w:rPr>
-        <w:lastRenderedPageBreak/>
         <w:t xml:space="preserve">│   </w:t>
       </w:r>
       <w:r>

</xml_diff>